<commit_message>
feat: use real crew findings and add demo controls
Mock mode still returns the deterministic report. OpenAI-compatible mode fills root cause and recommendation from the crew, and Gemini keys stay on the configured base URL. The dashboard can stop one scenario, keep chat text during refresh, and clear the incident list. The summary report matches this behavior.
</commit_message>
<xml_diff>
--- a/docs/DBot_Light_Bao_cao_tong_hop.docx
+++ b/docs/DBot_Light_Bao_cao_tong_hop.docx
@@ -38,7 +38,7 @@
         <w:br/>
       </w:r>
       <w:r>
-        <w:t>Ngày lập báo cáo: 14/10/2026</w:t>
+        <w:t>Ngày lập báo cáo: 14/10/2026. Cập nhật vận hành cùng ngày.</w:t>
         <w:br/>
       </w:r>
       <w:r>
@@ -72,7 +72,7 @@
                 <w:b/>
                 <w:sz w:val="19"/>
               </w:rPr>
-              <w:t>Kết luận: Bản tái dựng đã chuyển demo từ quy trình bấm thủ công sang mô hình D-Bot Light có alert realtime, webhook, diagnosis bằng CrewAI và chat theo incident. Đây là bản proof-of-concept chạy một máy, chưa phải hệ thống DBA production.</w:t>
+              <w:t>Kết luận: Bản tái dựng chạy được trên một máy với alert realtime, webhook, chat theo incident và điều khiển demo trên UI. Mock mode giữ báo cáo giả. Mode API thật lấy root cause và recommendation từ CrewAI. Đây vẫn là proof-of-concept, chưa phải hệ thống DBA production.</w:t>
             </w:r>
           </w:p>
         </w:tc>
@@ -941,7 +941,7 @@
     </w:p>
     <w:p>
       <w:r>
-        <w:t>User chat được gắn với từng incident. Người dùng không cần biết SQL; UI hiển thị summary, evidence, root cause sơ bộ và các câu hỏi tự nhiên như ‘Có chắc là do thiếu index không?’ hoặc ‘Session nào đang block?’.</w:t>
+        <w:t>User chat được gắn với từng incident. Người dùng không cần biết SQL; UI hiển thị summary, evidence, root cause và các câu hỏi tự nhiên như ‘Có chắc là do thiếu index không?’ hoặc ‘Session nào đang block?’. Ô chat giữ nguyên chữ đang gõ khi trang tự làm mới mỗi 5 giây.</w:t>
       </w:r>
     </w:p>
     <w:p>
@@ -2185,6 +2185,30 @@
         <w:pStyle w:val="ListBullet"/>
       </w:pPr>
       <w:r>
+        <w:t>Mỗi workload đang chạy có nút Dừng. Nút này gọi POST /api/scenarios/{name}/clear và chỉ tắt scenario đó.</w:t>
+      </w:r>
+    </w:p>
+    <w:p>
+      <w:pPr>
+        <w:pStyle w:val="ListBullet"/>
+      </w:pPr>
+      <w:r>
+        <w:t>Danh sách Incidents có nút Clear. Sau khi xác nhận, POST /api/incidents/clear xóa incident trên trang. Workload, knowledge và database không bị xóa.</w:t>
+      </w:r>
+    </w:p>
+    <w:p>
+      <w:pPr>
+        <w:pStyle w:val="ListBullet"/>
+      </w:pPr>
+      <w:r>
+        <w:t>Ô chat không bị xóa khi trang poll lại mỗi 5 giây, kể cả khi incident đang được cập nhật và ô đang được focus.</w:t>
+      </w:r>
+    </w:p>
+    <w:p>
+      <w:pPr>
+        <w:pStyle w:val="ListBullet"/>
+      </w:pPr>
+      <w:r>
         <w:t>Đã có Prometheus metrics endpoint và 5 alert rules tương ứng với 5 scenario.</w:t>
       </w:r>
     </w:p>
@@ -2217,7 +2241,7 @@
         <w:pStyle w:val="ListBullet"/>
       </w:pPr>
       <w:r>
-        <w:t>Đã giữ mock mode để chạy không cần API key và OpenAI-compatible mode cho LLM thật.</w:t>
+        <w:t>Mock mode vẫn trả báo cáo giả, không cần API key.</w:t>
       </w:r>
     </w:p>
     <w:p>
@@ -2225,7 +2249,7 @@
         <w:pStyle w:val="ListBullet"/>
       </w:pPr>
       <w:r>
-        <w:t>Đã bổ sung CLI trigger/clear/state và API diagnosis thủ công.</w:t>
+        <w:t>Mode API thật yêu cầu chief agent trả CrewFinding. Root cause, confidence, recommendation và summary lấy từ kết quả crew. Recommendation luôn requires_approval. Nếu crew lỗi, báo cáo ghi rõ mock-fallback.</w:t>
       </w:r>
     </w:p>
     <w:p>
@@ -2233,7 +2257,15 @@
         <w:pStyle w:val="ListBullet"/>
       </w:pPr>
       <w:r>
-        <w:t>Kiểm thử source hiện tại: 5 tests passed; Python compile và Compose/rules validation đều đạt.</w:t>
+        <w:t>LLM tương thích OpenAI, gồm Gemini qua https://generativelanguage.googleapis.com/v1beta/openai/, được trỏ bằng OPENAI_API_BASE. CrewAI nhận provider openai và base URL này, không gửi key Gemini sang api.openai.com.</w:t>
+      </w:r>
+    </w:p>
+    <w:p>
+      <w:pPr>
+        <w:pStyle w:val="ListBullet"/>
+      </w:pPr>
+      <w:r>
+        <w:t>Knowledge vẫn là data/experiences.json. Sửa file có hiệu lực ở lần chẩn đoán sau, không cần build lại image vì thư mục data được mount. Câu root cause của mock mode không đọc file này.</w:t>
       </w:r>
     </w:p>
     <w:tbl>
@@ -2308,7 +2340,7 @@
                 <w:b w:val="0"/>
                 <w:sz w:val="19"/>
               </w:rPr>
-              <w:t>Python syntax/compile</w:t>
+              <w:t>Unit tests</w:t>
             </w:r>
           </w:p>
         </w:tc>
@@ -2328,7 +2360,7 @@
                 <w:b w:val="0"/>
                 <w:sz w:val="19"/>
               </w:rPr>
-              <w:t>Đạt</w:t>
+              <w:t>8 passed trong container dbot</w:t>
             </w:r>
           </w:p>
         </w:tc>
@@ -2349,7 +2381,7 @@
                 <w:b w:val="0"/>
                 <w:sz w:val="19"/>
               </w:rPr>
-              <w:t>Unit tests</w:t>
+              <w:t>Mock diagnosis</w:t>
             </w:r>
           </w:p>
         </w:tc>
@@ -2368,7 +2400,7 @@
                 <w:b w:val="0"/>
                 <w:sz w:val="19"/>
               </w:rPr>
-              <w:t>5 passed</w:t>
+              <w:t>Đạt; root cause vẫn lấy từ bảng mapping</w:t>
             </w:r>
           </w:p>
         </w:tc>
@@ -2390,7 +2422,7 @@
                 <w:b w:val="0"/>
                 <w:sz w:val="19"/>
               </w:rPr>
-              <w:t>Compose YAML parse</w:t>
+              <w:t>Báo cáo mode API</w:t>
             </w:r>
           </w:p>
         </w:tc>
@@ -2410,7 +2442,7 @@
                 <w:b w:val="0"/>
                 <w:sz w:val="19"/>
               </w:rPr>
-              <w:t>Đạt; đủ postgres, dbot, prometheus, alertmanager</w:t>
+              <w:t>Đạt bằng crew finding giả lập; không gọi API tính phí trong test</w:t>
             </w:r>
           </w:p>
         </w:tc>
@@ -2431,7 +2463,7 @@
                 <w:b w:val="0"/>
                 <w:sz w:val="19"/>
               </w:rPr>
-              <w:t>Prometheus rules parse</w:t>
+              <w:t>Nút Dừng và giữ chữ ô chat</w:t>
             </w:r>
           </w:p>
         </w:tc>
@@ -2450,7 +2482,7 @@
                 <w:b w:val="0"/>
                 <w:sz w:val="19"/>
               </w:rPr>
-              <w:t>Đạt; 5 rules</w:t>
+              <w:t>Đạt trên Chrome headless với API giả</w:t>
             </w:r>
           </w:p>
         </w:tc>
@@ -2472,7 +2504,7 @@
                 <w:b w:val="0"/>
                 <w:sz w:val="19"/>
               </w:rPr>
-              <w:t>Mock diagnosis</w:t>
+              <w:t>Nút Clear incident</w:t>
             </w:r>
           </w:p>
         </w:tc>
@@ -2492,7 +2524,7 @@
                 <w:b w:val="0"/>
                 <w:sz w:val="19"/>
               </w:rPr>
-              <w:t>Đạt; không cần API key</w:t>
+              <w:t>Đạt: POST /api/incidents/clear trả cleared và danh sách rỗng</w:t>
             </w:r>
           </w:p>
         </w:tc>
@@ -2513,7 +2545,7 @@
                 <w:b w:val="0"/>
                 <w:sz w:val="19"/>
               </w:rPr>
-              <w:t>Docker runtime trên sandbox</w:t>
+              <w:t>Docker trên máy phát triển</w:t>
             </w:r>
           </w:p>
         </w:tc>
@@ -2532,7 +2564,49 @@
                 <w:b w:val="0"/>
                 <w:sz w:val="19"/>
               </w:rPr>
-              <w:t>Chưa chạy vì sandbox hiện không có Docker daemon</w:t>
+              <w:t>Đạt: Docker Desktop, postgres healthy, dbot healthy</w:t>
+            </w:r>
+          </w:p>
+        </w:tc>
+      </w:tr>
+      <w:tr>
+        <w:tc>
+          <w:tcPr>
+            <w:tcW w:type="dxa" w:w="4608"/>
+            <w:vAlign w:val="center"/>
+            <w:shd w:fill="EAF2F8"/>
+          </w:tcPr>
+          <w:p>
+            <w:pPr>
+              <w:spacing w:after="40"/>
+            </w:pPr>
+            <w:r/>
+            <w:r>
+              <w:rPr>
+                <w:b w:val="0"/>
+                <w:sz w:val="19"/>
+              </w:rPr>
+              <w:t>Gemini end-to-end</w:t>
+            </w:r>
+          </w:p>
+        </w:tc>
+        <w:tc>
+          <w:tcPr>
+            <w:tcW w:type="dxa" w:w="4032"/>
+            <w:vAlign w:val="center"/>
+            <w:shd w:fill="EAF2F8"/>
+          </w:tcPr>
+          <w:p>
+            <w:pPr>
+              <w:spacing w:after="40"/>
+            </w:pPr>
+            <w:r/>
+            <w:r>
+              <w:rPr>
+                <w:b w:val="0"/>
+                <w:sz w:val="19"/>
+              </w:rPr>
+              <w:t>Đã sửa đường gọi. Chưa ghi một diagnosis Gemini thành công trong báo cáo này</w:t>
             </w:r>
           </w:p>
         </w:tc>
@@ -2609,7 +2683,7 @@
         <w:pStyle w:val="ListNumber"/>
       </w:pPr>
       <w:r>
-        <w:t>Chờ 10–20 giây để Prometheus và Alertmanager gửi incident</w:t>
+        <w:t>Workload đang chạy hiện nút Dừng. Bấm Dừng để tắt riêng scenario đó</w:t>
       </w:r>
     </w:p>
     <w:p>
@@ -2617,7 +2691,7 @@
         <w:pStyle w:val="ListNumber"/>
       </w:pPr>
       <w:r>
-        <w:t>Chọn incident và hỏi trong chat: ‘Session nào đang block?’ hoặc ‘Có chắc do thiếu index không?’</w:t>
+        <w:t>Chờ khoảng 30–60 giây để Prometheus và Alertmanager gửi incident</w:t>
       </w:r>
     </w:p>
     <w:p>
@@ -2625,12 +2699,58 @@
         <w:pStyle w:val="ListNumber"/>
       </w:pPr>
       <w:r>
-        <w:t>Dọn demo: bấm Clear all scenarios hoặc chạy docker compose down</w:t>
+        <w:t>Chọn incident và hỏi trong chat. Chữ đang gõ không bị trang tự làm mới xóa</w:t>
+      </w:r>
+    </w:p>
+    <w:p>
+      <w:pPr>
+        <w:pStyle w:val="ListNumber"/>
+      </w:pPr>
+      <w:r>
+        <w:t>Bấm Clear ở khung Incidents để xóa danh sách sau khi xác nhận</w:t>
+      </w:r>
+    </w:p>
+    <w:p>
+      <w:pPr>
+        <w:pStyle w:val="ListNumber"/>
+      </w:pPr>
+      <w:r>
+        <w:t>Dọn workload: bấm Clear all scenarios hoặc chạy docker compose down</w:t>
       </w:r>
     </w:p>
     <w:p>
       <w:r>
-        <w:t>Nếu muốn reset hoàn toàn database và metrics: docker compose down -v rồi chạy lại docker compose up --build -d.</w:t>
+        <w:t>Đổi LLM trong .env rồi chạy docker compose up -d. Không cần build lại image. Container dbot được tạo lại để đọc biến mới. Tải lại trang không đủ.</w:t>
+      </w:r>
+    </w:p>
+    <w:p>
+      <w:r>
+        <w:t>Ví dụ Gemini, key lấy từ Google AI Studio:</w:t>
+      </w:r>
+    </w:p>
+    <w:p>
+      <w:r>
+        <w:t>LLM_MODE=openai</w:t>
+      </w:r>
+    </w:p>
+    <w:p>
+      <w:r>
+        <w:t>OPENAI_API_KEY=&lt;gemini-api-key&gt;</w:t>
+      </w:r>
+    </w:p>
+    <w:p>
+      <w:r>
+        <w:t>OPENAI_MODEL_NAME=&lt;model id trong AI Studio, ví dụ gemini-2.5-flash&gt;</w:t>
+      </w:r>
+    </w:p>
+    <w:p>
+      <w:r>
+        <w:t>OPENAI_API_BASE=https://generativelanguage.googleapis.com/v1beta/openai/</w:t>
+      </w:r>
+    </w:p>
+    <w:p>
+      <w:r>
+        <w:t>Xóa sạch dữ liệu demo rồi khởi động lại: docker compose down -v; xóa data/incidents.json và thư mục reports; sau đó docker compose up --build -d. Lệnh down -v xóa volume Postgres, Prometheus và Alertmanager. experiences.json và .env được giữ.</w:t>
       </w:r>
     </w:p>
     <w:p>
@@ -2718,7 +2838,7 @@
                 <w:b w:val="0"/>
                 <w:sz w:val="19"/>
               </w:rPr>
-              <w:t>Experience seed dạng JSON</w:t>
+              <w:t>Experience JSON chỉ đưa tên vào evidence mock; mode API đưa content vào context của crew</w:t>
             </w:r>
           </w:p>
         </w:tc>
@@ -2923,7 +3043,7 @@
     </w:p>
     <w:p>
       <w:r>
-        <w:t>Bản tái dựng đã đạt mục tiêu tạo một D-Bot Light dễ chạy, có cả realtime alert flow và user chat flow. Kiến trúc giữ được thông điệp cốt lõi của D-Bot: LLM không chỉ nhìn triệu chứng mà phải kết hợp maintenance experience, metrics, system views, query plan và tool evidence.</w:t>
+        <w:t>Bản tái dựng đã đạt mục tiêu tạo một D-Bot Light dễ chạy, có realtime alert flow, user chat và các nút điều khiển demo. Mock mode dùng để trình diễn không cần API. Mode API thật dùng kết quả có cấu trúc của CrewAI cho root cause và recommendation. Kiến trúc giữ thông điệp cốt lõi của D-Bot: kết luận phải dựa trên maintenance experience, metrics, system views, query plan và tool evidence.</w:t>
       </w:r>
     </w:p>
     <w:p>

</xml_diff>